<commit_message>
harmonizace: registr a zadani - zaznam rozhodnuti a vysledku Faze B
Do harmonizace_registr.md doplneno:
- rozhodnuti zadavatele a odpovedi autoru metodiky ke vsem 18 nalezum,
- prehled 8 commitu Faze B a stav kazdeho nalezu,
- merena tabulka dopadu na ostrych datech z NDOP,
- prehled overeni vcetne toho, co overit NELZE (plny beh kaskady),
- kontrola neregrese mimo obojzivelniky,
- dva nove nalezy vznikle pri implementaci: H-19 (prazdne trilete okno
  NA vs. 0) a H-20 (uzemi bez evidovaneho ciloveho stavu v Tabulce 2),
  oba cekaji na rozhodnuti.

Do harmonizace_prompt.md doplnena zavazna rozhodnuti (par. 2.1) a opravena
recepta na extrakci textu z .docx - puvodni sed varianta neodstranovala
<w:moveFrom>, coz vyrabelo fantomove odstavce.

Co-Authored-By: Claude Opus 5 <noreply@anthropic.com>
</commit_message>
<xml_diff>
--- a/Metodiky/Obojzivelnici/met_ssEVL_SLOUCENE_teren_a_vyhodnocovani_obojziv_2024_zmeny.docx
+++ b/Metodiky/Obojzivelnici/met_ssEVL_SLOUCENE_teren_a_vyhodnocovani_obojziv_2024_zmeny.docx
@@ -7278,10 +7278,9 @@
           <w:szCs w:val="24"/>
         </w:rPr>
       </w:pPr>
-      <w:bookmarkStart w:id="59" w:name="_GoBack"/>
+      <w:commentRangeStart w:id="59"/>
       <w:commentRangeStart w:id="60"/>
-      <w:commentRangeStart w:id="61"/>
-      <w:del w:id="62" w:author="Jonáš Gaigr2" w:date="2026-08-19T20:36:00Z">
+      <w:del w:id="61" w:author="Jonáš Gaigr2" w:date="2026-08-19T20:36:00Z">
         <w:r>
           <w:rPr>
             <w:szCs w:val="24"/>
@@ -7300,6 +7299,14 @@
           </w:rPr>
           <w:delText xml:space="preserve"> využity živochytné pasti</w:delText>
         </w:r>
+        <w:commentRangeEnd w:id="59"/>
+        <w:r>
+          <w:rPr>
+            <w:rStyle w:val="Odkaznakoment"/>
+            <w:rFonts w:eastAsia="Batang"/>
+          </w:rPr>
+          <w:commentReference w:id="59"/>
+        </w:r>
         <w:commentRangeEnd w:id="60"/>
         <w:r>
           <w:rPr>
@@ -7308,14 +7315,6 @@
           </w:rPr>
           <w:commentReference w:id="60"/>
         </w:r>
-        <w:commentRangeEnd w:id="61"/>
-        <w:r>
-          <w:rPr>
-            <w:rStyle w:val="Odkaznakoment"/>
-            <w:rFonts w:eastAsia="Batang"/>
-          </w:rPr>
-          <w:commentReference w:id="61"/>
-        </w:r>
         <w:r>
           <w:rPr>
             <w:szCs w:val="24"/>
@@ -7323,7 +7322,7 @@
           <w:delText>, proběhne v</w:delText>
         </w:r>
       </w:del>
-      <w:ins w:id="63" w:author="Jonáš Gaigr2" w:date="2026-08-19T20:36:00Z">
+      <w:ins w:id="62" w:author="Jonáš Gaigr2" w:date="2026-08-19T20:36:00Z">
         <w:r>
           <w:rPr>
             <w:szCs w:val="24"/>
@@ -7337,7 +7336,7 @@
         </w:rPr>
         <w:t xml:space="preserve"> rámci této kontroly </w:t>
       </w:r>
-      <w:ins w:id="64" w:author="Jonáš Gaigr2" w:date="2026-08-19T20:36:00Z">
+      <w:ins w:id="63" w:author="Jonáš Gaigr2" w:date="2026-08-19T20:36:00Z">
         <w:r>
           <w:rPr>
             <w:szCs w:val="24"/>
@@ -7351,7 +7350,7 @@
         </w:rPr>
         <w:t xml:space="preserve">i </w:t>
       </w:r>
-      <w:del w:id="65" w:author="Jonáš Gaigr2" w:date="2026-08-19T20:36:00Z">
+      <w:del w:id="64" w:author="Jonáš Gaigr2" w:date="2026-08-19T20:36:00Z">
         <w:r>
           <w:rPr>
             <w:szCs w:val="24"/>
@@ -7365,7 +7364,7 @@
         </w:rPr>
         <w:t>instalace</w:t>
       </w:r>
-      <w:ins w:id="66" w:author="Jonáš Gaigr2" w:date="2026-08-19T20:36:00Z">
+      <w:ins w:id="65" w:author="Jonáš Gaigr2" w:date="2026-08-19T20:36:00Z">
         <w:r>
           <w:rPr>
             <w:szCs w:val="24"/>
@@ -7377,16 +7376,9 @@
         <w:rPr>
           <w:szCs w:val="24"/>
         </w:rPr>
-        <w:t xml:space="preserve">. </w:t>
-      </w:r>
-      <w:bookmarkEnd w:id="59"/>
-      <w:r>
-        <w:rPr>
-          <w:szCs w:val="24"/>
-        </w:rPr>
-        <w:t>Druhý den</w:t>
-      </w:r>
-      <w:ins w:id="67" w:author="Jonáš Gaigr2" w:date="2026-08-19T20:37:00Z">
+        <w:t>. Druhý den</w:t>
+      </w:r>
+      <w:ins w:id="66" w:author="Jonáš Gaigr2" w:date="2026-08-19T20:37:00Z">
         <w:r>
           <w:rPr>
             <w:szCs w:val="24"/>
@@ -7692,9 +7684,9 @@
         </w:rPr>
         <w:t xml:space="preserve"> </w:t>
       </w:r>
+      <w:commentRangeStart w:id="67"/>
       <w:commentRangeStart w:id="68"/>
       <w:commentRangeStart w:id="69"/>
-      <w:commentRangeStart w:id="70"/>
       <w:r>
         <w:rPr>
           <w:rFonts w:ascii="Times New Roman" w:hAnsi="Times New Roman"/>
@@ -7705,29 +7697,29 @@
         </w:rPr>
         <w:t>Prevence zavleční patogenů</w:t>
       </w:r>
-      <w:commentRangeEnd w:id="68"/>
+      <w:commentRangeEnd w:id="67"/>
       <w:r>
         <w:rPr>
           <w:rStyle w:val="Odkaznakoment"/>
           <w:rFonts w:asciiTheme="minorHAnsi" w:eastAsia="Batang" w:hAnsiTheme="minorHAnsi" w:cstheme="minorBidi"/>
         </w:rPr>
-        <w:commentReference w:id="68"/>
-      </w:r>
-      <w:commentRangeEnd w:id="69"/>
+        <w:commentReference w:id="67"/>
+      </w:r>
+      <w:commentRangeEnd w:id="68"/>
       <w:r>
         <w:rPr>
           <w:rStyle w:val="Odkaznakoment"/>
           <w:rFonts w:asciiTheme="minorHAnsi" w:eastAsia="Batang" w:hAnsiTheme="minorHAnsi" w:cstheme="minorBidi"/>
         </w:rPr>
-        <w:commentReference w:id="69"/>
-      </w:r>
-      <w:commentRangeEnd w:id="70"/>
+        <w:commentReference w:id="68"/>
+      </w:r>
+      <w:commentRangeEnd w:id="69"/>
       <w:r>
         <w:rPr>
           <w:rStyle w:val="Odkaznakoment"/>
           <w:rFonts w:asciiTheme="minorHAnsi" w:eastAsia="Batang" w:hAnsiTheme="minorHAnsi" w:cstheme="minorBidi"/>
         </w:rPr>
-        <w:commentReference w:id="70"/>
+        <w:commentReference w:id="69"/>
       </w:r>
     </w:p>
     <w:p>
@@ -7784,7 +7776,7 @@
         <w:spacing w:after="120" w:line="240" w:lineRule="auto"/>
         <w:jc w:val="both"/>
         <w:rPr>
-          <w:ins w:id="71" w:author="Jonáš Gaigr2" w:date="2026-08-06T13:28:00Z"/>
+          <w:ins w:id="70" w:author="Jonáš Gaigr2" w:date="2026-08-06T13:28:00Z"/>
           <w:rFonts w:cs="Times New Roman"/>
           <w:szCs w:val="24"/>
         </w:rPr>
@@ -8067,43 +8059,7 @@
         <w:rPr>
           <w:szCs w:val="24"/>
         </w:rPr>
-        <w:t xml:space="preserve"> hodnocen samostatně. Všechny </w:t>
-      </w:r>
-      <w:r>
-        <w:rPr>
-          <w:szCs w:val="24"/>
-        </w:rPr>
-        <w:t>indikátor</w:t>
-      </w:r>
-      <w:r>
-        <w:rPr>
-          <w:szCs w:val="24"/>
-        </w:rPr>
-        <w:t xml:space="preserve">y se vyhodnocují pouze na úrovni celé EVL. Při výpočtech limitních hodnot u většiny </w:t>
-      </w:r>
-      <w:r>
-        <w:rPr>
-          <w:szCs w:val="24"/>
-        </w:rPr>
-        <w:t>indikátor</w:t>
-      </w:r>
-      <w:r>
-        <w:rPr>
-          <w:szCs w:val="24"/>
-        </w:rPr>
-        <w:t xml:space="preserve">ů je dále zohledňována velikost EVL i počet zde sledovaných </w:t>
-      </w:r>
-      <w:r>
-        <w:rPr>
-          <w:szCs w:val="24"/>
-        </w:rPr>
-        <w:t>DP</w:t>
-      </w:r>
-      <w:r>
-        <w:rPr>
-          <w:szCs w:val="24"/>
-        </w:rPr>
-        <w:t>.</w:t>
+        <w:t xml:space="preserve"> hodnocen samostatně. </w:t>
       </w:r>
     </w:p>
     <w:p>
@@ -9246,14 +9202,20 @@
           <w:szCs w:val="24"/>
         </w:rPr>
       </w:pPr>
-      <w:commentRangeStart w:id="72"/>
       <w:r>
         <w:rPr>
           <w:rFonts w:ascii="Times New Roman" w:hAnsi="Times New Roman"/>
           <w:b/>
           <w:szCs w:val="24"/>
         </w:rPr>
-        <w:t>Z</w:t>
+        <w:t>Zastínění litorálu okolní vegetací</w:t>
+      </w:r>
+      <w:r>
+        <w:rPr>
+          <w:rStyle w:val="Odkaznakoment"/>
+          <w:rFonts w:ascii="Times New Roman" w:eastAsia="Batang" w:hAnsi="Times New Roman" w:cstheme="minorBidi"/>
+        </w:rPr>
+        <w:commentReference w:id="71"/>
       </w:r>
       <w:r>
         <w:rPr>
@@ -9261,7 +9223,7 @@
           <w:b/>
           <w:szCs w:val="24"/>
         </w:rPr>
-        <w:t>astínění hladiny</w:t>
+        <w:t>.</w:t>
       </w:r>
       <w:r>
         <w:rPr>
@@ -9274,23 +9236,20 @@
       <w:r>
         <w:rPr>
           <w:rFonts w:ascii="Times New Roman" w:hAnsi="Times New Roman"/>
-          <w:b/>
-          <w:szCs w:val="24"/>
-        </w:rPr>
-        <w:t>okolní vegetací</w:t>
+          <w:szCs w:val="24"/>
+        </w:rPr>
+        <w:t>Osluněn</w:t>
       </w:r>
       <w:r>
         <w:rPr>
           <w:rFonts w:ascii="Times New Roman" w:hAnsi="Times New Roman"/>
-          <w:b/>
-          <w:szCs w:val="24"/>
-        </w:rPr>
-        <w:t>.</w:t>
+          <w:szCs w:val="24"/>
+        </w:rPr>
+        <w:t>ý</w:t>
       </w:r>
       <w:r>
         <w:rPr>
           <w:rFonts w:ascii="Times New Roman" w:hAnsi="Times New Roman"/>
-          <w:b/>
           <w:szCs w:val="24"/>
         </w:rPr>
         <w:t xml:space="preserve"> </w:t>
@@ -9300,7 +9259,30 @@
           <w:rFonts w:ascii="Times New Roman" w:hAnsi="Times New Roman"/>
           <w:szCs w:val="24"/>
         </w:rPr>
-        <w:t>Osluněná hladina se rychleji prohřívá, což urychluje vývoj larev a zvyšuje pravděpodobnost dokončení metamorfózy v rámci sezóny; to je zásadní zejména pro druhy mělkých a rychle se prohřívajících tůní (</w:t>
+        <w:t>litorál</w:t>
+      </w:r>
+      <w:r>
+        <w:rPr>
+          <w:rFonts w:ascii="Times New Roman" w:hAnsi="Times New Roman"/>
+          <w:szCs w:val="24"/>
+        </w:rPr>
+        <w:t xml:space="preserve"> </w:t>
+      </w:r>
+      <w:r>
+        <w:rPr>
+          <w:rFonts w:ascii="Times New Roman" w:hAnsi="Times New Roman"/>
+          <w:szCs w:val="24"/>
+        </w:rPr>
+        <w:t>se rychleji prohřívá, což urychluje vývoj larev a zvyšuje pravděpodobnost dokončení metamorfózy v rámci sezóny; to je zásadní zejména pro druhy mělkých a rychle s</w:t>
+      </w:r>
+      <w:bookmarkStart w:id="72" w:name="_GoBack"/>
+      <w:bookmarkEnd w:id="72"/>
+      <w:r>
+        <w:rPr>
+          <w:rFonts w:ascii="Times New Roman" w:hAnsi="Times New Roman"/>
+          <w:szCs w:val="24"/>
+        </w:rPr>
+        <w:t>e prohřívajících tůní (</w:t>
       </w:r>
       <w:r>
         <w:rPr>
@@ -9322,7 +9304,21 @@
           <w:rFonts w:ascii="Times New Roman" w:hAnsi="Times New Roman"/>
           <w:szCs w:val="24"/>
         </w:rPr>
-        <w:t>). Silné zastínění vývoj zpomaluje, potlačuje ponořenou vegetaci a spolu se zvýšeným opadem přispívá k deficitu kyslíku. Zastínění se hodnotí pro vodní hladinu; dřeviny v okolí plochy naopak mohou představovat kvalitní terestrické prostředí.</w:t>
+        <w:t>). Silné zastínění vývoj zpomaluje, potlačuje ponořenou vegetaci a spolu se zvýšeným opadem přispívá k deficitu kyslíku. Zastínění se hodnotí pro</w:t>
+      </w:r>
+      <w:r>
+        <w:rPr>
+          <w:rFonts w:ascii="Times New Roman" w:hAnsi="Times New Roman"/>
+          <w:szCs w:val="24"/>
+        </w:rPr>
+        <w:t xml:space="preserve"> litorál</w:t>
+      </w:r>
+      <w:r>
+        <w:rPr>
+          <w:rFonts w:ascii="Times New Roman" w:hAnsi="Times New Roman"/>
+          <w:szCs w:val="24"/>
+        </w:rPr>
+        <w:t>; dřeviny v okolí plochy naopak mohou představovat kvalitní terestrické prostředí.</w:t>
       </w:r>
     </w:p>
     <w:p>
@@ -9342,19 +9338,65 @@
       </w:pPr>
       <w:r>
         <w:rPr>
+          <w:rStyle w:val="Odkaznakoment"/>
+          <w:rFonts w:ascii="Times New Roman" w:eastAsia="Batang" w:hAnsi="Times New Roman" w:cstheme="minorBidi"/>
+        </w:rPr>
+        <w:commentReference w:id="73"/>
+      </w:r>
+      <w:r>
+        <w:rPr>
           <w:rFonts w:ascii="Times New Roman" w:hAnsi="Times New Roman"/>
           <w:b/>
           <w:szCs w:val="24"/>
         </w:rPr>
-        <w:t>Zastínění litorálu okolní vegetací</w:t>
-      </w:r>
-      <w:commentRangeEnd w:id="72"/>
-      <w:r>
-        <w:rPr>
-          <w:rStyle w:val="Odkaznakoment"/>
-          <w:rFonts w:ascii="Times New Roman" w:eastAsia="Batang" w:hAnsi="Times New Roman" w:cstheme="minorBidi"/>
-        </w:rPr>
-        <w:commentReference w:id="72"/>
+        <w:t>P</w:t>
+      </w:r>
+      <w:r>
+        <w:rPr>
+          <w:rFonts w:ascii="Times New Roman" w:hAnsi="Times New Roman"/>
+          <w:b/>
+          <w:szCs w:val="24"/>
+        </w:rPr>
+        <w:t xml:space="preserve">locha s hloubkou menší než </w:t>
+      </w:r>
+      <w:r>
+        <w:rPr>
+          <w:rFonts w:ascii="Times New Roman" w:hAnsi="Times New Roman"/>
+          <w:b/>
+          <w:szCs w:val="24"/>
+        </w:rPr>
+        <w:t xml:space="preserve">50 </w:t>
+      </w:r>
+      <w:r>
+        <w:rPr>
+          <w:rFonts w:ascii="Times New Roman" w:hAnsi="Times New Roman"/>
+          <w:b/>
+          <w:szCs w:val="24"/>
+        </w:rPr>
+        <w:t>cm</w:t>
+      </w:r>
+      <w:r>
+        <w:rPr>
+          <w:rFonts w:ascii="Times New Roman" w:hAnsi="Times New Roman"/>
+          <w:b/>
+          <w:szCs w:val="24"/>
+        </w:rPr>
+        <w:t>.</w:t>
+      </w:r>
+      <w:r>
+        <w:rPr>
+          <w:rFonts w:ascii="Times New Roman" w:hAnsi="Times New Roman"/>
+          <w:b/>
+          <w:szCs w:val="24"/>
+        </w:rPr>
+        <w:t xml:space="preserve"> </w:t>
+      </w:r>
+      <w:r>
+        <w:rPr>
+          <w:rFonts w:ascii="Times New Roman" w:hAnsi="Times New Roman"/>
+          <w:szCs w:val="24"/>
+        </w:rPr>
+        <w:t>Mělčiny jsou nejrychleji se prohřívající částí vodní plochy a pro řadu cílových druhů představují hlavní prostor pro kladení a vývoj larev. Zároveň jsou hůře dostupné pro ryby a mírně skloněné břehy usnadňují juvenilům opuštění vody. Absence mělčin (strmé břehy, technicky upravené nádrže) je nepříznivá i tehdy, je-li plocha jinak vyhovující; rozsah mělčin je však třeba posuzovat spolu s rizikem předčasného vyschnutí.</w:t>
       </w:r>
     </w:p>
     <w:p>
@@ -9372,118 +9414,6 @@
           <w:szCs w:val="24"/>
         </w:rPr>
       </w:pPr>
-      <w:commentRangeStart w:id="73"/>
-      <w:r>
-        <w:rPr>
-          <w:rFonts w:ascii="Times New Roman" w:hAnsi="Times New Roman"/>
-          <w:b/>
-          <w:szCs w:val="24"/>
-        </w:rPr>
-        <w:t>Zaplavení litorálu</w:t>
-      </w:r>
-      <w:commentRangeEnd w:id="73"/>
-      <w:r>
-        <w:rPr>
-          <w:rStyle w:val="Odkaznakoment"/>
-          <w:rFonts w:ascii="Times New Roman" w:eastAsia="Batang" w:hAnsi="Times New Roman" w:cstheme="minorBidi"/>
-        </w:rPr>
-        <w:commentReference w:id="73"/>
-      </w:r>
-    </w:p>
-    <w:p>
-      <w:pPr>
-        <w:pStyle w:val="Odstavecseseznamem"/>
-        <w:numPr>
-          <w:ilvl w:val="0"/>
-          <w:numId w:val="17"/>
-        </w:numPr>
-        <w:spacing w:after="120" w:line="240" w:lineRule="auto"/>
-        <w:contextualSpacing w:val="0"/>
-        <w:jc w:val="both"/>
-        <w:rPr>
-          <w:rFonts w:ascii="Times New Roman" w:hAnsi="Times New Roman"/>
-          <w:szCs w:val="24"/>
-        </w:rPr>
-      </w:pPr>
-      <w:r>
-        <w:rPr>
-          <w:rFonts w:ascii="Times New Roman" w:hAnsi="Times New Roman"/>
-          <w:b/>
-          <w:szCs w:val="24"/>
-        </w:rPr>
-        <w:t>P</w:t>
-      </w:r>
-      <w:r>
-        <w:rPr>
-          <w:rFonts w:ascii="Times New Roman" w:hAnsi="Times New Roman"/>
-          <w:b/>
-          <w:szCs w:val="24"/>
-        </w:rPr>
-        <w:t xml:space="preserve">locha s hloubkou menší než </w:t>
-      </w:r>
-      <w:r>
-        <w:rPr>
-          <w:rFonts w:ascii="Times New Roman" w:hAnsi="Times New Roman"/>
-          <w:b/>
-          <w:szCs w:val="24"/>
-        </w:rPr>
-        <w:t>50</w:t>
-      </w:r>
-      <w:r>
-        <w:rPr>
-          <w:rFonts w:ascii="Times New Roman" w:hAnsi="Times New Roman"/>
-          <w:b/>
-          <w:szCs w:val="24"/>
-        </w:rPr>
-        <w:t xml:space="preserve"> </w:t>
-      </w:r>
-      <w:r>
-        <w:rPr>
-          <w:rFonts w:ascii="Times New Roman" w:hAnsi="Times New Roman"/>
-          <w:b/>
-          <w:szCs w:val="24"/>
-        </w:rPr>
-        <w:t>cm</w:t>
-      </w:r>
-      <w:r>
-        <w:rPr>
-          <w:rFonts w:ascii="Times New Roman" w:hAnsi="Times New Roman"/>
-          <w:b/>
-          <w:szCs w:val="24"/>
-        </w:rPr>
-        <w:t>.</w:t>
-      </w:r>
-      <w:r>
-        <w:rPr>
-          <w:rFonts w:ascii="Times New Roman" w:hAnsi="Times New Roman"/>
-          <w:b/>
-          <w:szCs w:val="24"/>
-        </w:rPr>
-        <w:t xml:space="preserve"> </w:t>
-      </w:r>
-      <w:r>
-        <w:rPr>
-          <w:rFonts w:ascii="Times New Roman" w:hAnsi="Times New Roman"/>
-          <w:szCs w:val="24"/>
-        </w:rPr>
-        <w:t>Mělčiny jsou nejrychleji se prohřívající částí vodní plochy a pro řadu cílových druhů představují hlavní prostor pro kladení a vývoj larev. Zároveň jsou hůře dostupné pro ryby a mírně skloněné břehy usnadňují juvenilům opuštění vody. Absence mělčin (strmé břehy, technicky upravené nádrže) je nepříznivá i tehdy, je-li plocha jinak vyhovující; rozsah mělčin je však třeba posuzovat spolu s rizikem předčasného vyschnutí.</w:t>
-      </w:r>
-    </w:p>
-    <w:p>
-      <w:pPr>
-        <w:pStyle w:val="Odstavecseseznamem"/>
-        <w:numPr>
-          <w:ilvl w:val="0"/>
-          <w:numId w:val="17"/>
-        </w:numPr>
-        <w:spacing w:after="120" w:line="240" w:lineRule="auto"/>
-        <w:contextualSpacing w:val="0"/>
-        <w:jc w:val="both"/>
-        <w:rPr>
-          <w:rFonts w:ascii="Times New Roman" w:hAnsi="Times New Roman"/>
-          <w:szCs w:val="24"/>
-        </w:rPr>
-      </w:pPr>
       <w:r>
         <w:rPr>
           <w:rFonts w:ascii="Times New Roman" w:hAnsi="Times New Roman"/>
@@ -9767,14 +9697,7 @@
           <w:szCs w:val="24"/>
           <w:lang w:eastAsia="cs-CZ"/>
         </w:rPr>
-        <w:t>li dostupné informace k jeho hodnocení.</w:t>
-      </w:r>
-      <w:r>
-        <w:rPr>
-          <w:rStyle w:val="Odkaznakoment"/>
-          <w:rFonts w:eastAsia="Batang"/>
-        </w:rPr>
-        <w:commentReference w:id="74"/>
+        <w:t>li dostupné informace k jeho hodnocení</w:t>
       </w:r>
       <w:r>
         <w:rPr>
@@ -9782,7 +9705,7 @@
           <w:szCs w:val="24"/>
           <w:lang w:eastAsia="cs-CZ"/>
         </w:rPr>
-        <w:t xml:space="preserve"> Pokud je alespoň jeden z indikátorů hodnocen jako neznámý, je celkový stav DP neznámý.</w:t>
+        <w:t>.</w:t>
       </w:r>
     </w:p>
     <w:p>
@@ -10327,135 +10250,6 @@
                 <w:lang w:val="en-GB" w:eastAsia="en-GB"/>
               </w:rPr>
               <w:t>špatný</w:t>
-            </w:r>
-          </w:p>
-        </w:tc>
-      </w:tr>
-      <w:tr>
-        <w:trPr>
-          <w:trHeight w:val="315"/>
-        </w:trPr>
-        <w:tc>
-          <w:tcPr>
-            <w:tcW w:w="0" w:type="auto"/>
-            <w:tcBorders>
-              <w:top w:val="single" w:sz="6" w:space="0" w:color="CCCCCC"/>
-              <w:left w:val="single" w:sz="6" w:space="0" w:color="CCCCCC"/>
-              <w:bottom w:val="single" w:sz="6" w:space="0" w:color="CCCCCC"/>
-              <w:right w:val="single" w:sz="6" w:space="0" w:color="CCCCCC"/>
-            </w:tcBorders>
-            <w:shd w:val="clear" w:color="auto" w:fill="999999"/>
-            <w:tcMar>
-              <w:top w:w="30" w:type="dxa"/>
-              <w:left w:w="45" w:type="dxa"/>
-              <w:bottom w:w="30" w:type="dxa"/>
-              <w:right w:w="45" w:type="dxa"/>
-            </w:tcMar>
-            <w:vAlign w:val="bottom"/>
-            <w:hideMark/>
-          </w:tcPr>
-          <w:p>
-            <w:pPr>
-              <w:spacing w:after="0" w:line="240" w:lineRule="auto"/>
-              <w:rPr>
-                <w:rFonts w:eastAsia="Times New Roman" w:cs="Times New Roman"/>
-                <w:sz w:val="20"/>
-                <w:szCs w:val="20"/>
-                <w:lang w:val="en-GB" w:eastAsia="en-GB"/>
-              </w:rPr>
-            </w:pPr>
-            <w:r>
-              <w:rPr>
-                <w:rFonts w:eastAsia="Times New Roman" w:cs="Times New Roman"/>
-                <w:sz w:val="20"/>
-                <w:szCs w:val="20"/>
-                <w:lang w:val="en-GB" w:eastAsia="en-GB"/>
-              </w:rPr>
-              <w:t>min 1 neznámý</w:t>
-            </w:r>
-          </w:p>
-        </w:tc>
-        <w:tc>
-          <w:tcPr>
-            <w:tcW w:w="0" w:type="auto"/>
-            <w:tcBorders>
-              <w:top w:val="single" w:sz="6" w:space="0" w:color="CCCCCC"/>
-              <w:left w:val="single" w:sz="6" w:space="0" w:color="CCCCCC"/>
-              <w:bottom w:val="single" w:sz="6" w:space="0" w:color="CCCCCC"/>
-              <w:right w:val="single" w:sz="6" w:space="0" w:color="CCCCCC"/>
-            </w:tcBorders>
-            <w:shd w:val="clear" w:color="auto" w:fill="999999"/>
-            <w:tcMar>
-              <w:top w:w="30" w:type="dxa"/>
-              <w:left w:w="45" w:type="dxa"/>
-              <w:bottom w:w="30" w:type="dxa"/>
-              <w:right w:w="45" w:type="dxa"/>
-            </w:tcMar>
-            <w:vAlign w:val="bottom"/>
-            <w:hideMark/>
-          </w:tcPr>
-          <w:p>
-            <w:pPr>
-              <w:spacing w:after="0" w:line="240" w:lineRule="auto"/>
-              <w:rPr>
-                <w:rFonts w:eastAsia="Times New Roman" w:cs="Times New Roman"/>
-                <w:sz w:val="20"/>
-                <w:szCs w:val="20"/>
-                <w:lang w:val="en-GB" w:eastAsia="en-GB"/>
-              </w:rPr>
-            </w:pPr>
-            <w:r>
-              <w:rPr>
-                <w:rFonts w:eastAsia="Times New Roman" w:cs="Times New Roman"/>
-                <w:sz w:val="20"/>
-                <w:szCs w:val="20"/>
-                <w:lang w:val="en-GB" w:eastAsia="en-GB"/>
-              </w:rPr>
-              <w:t>min 1 neznámý</w:t>
-            </w:r>
-          </w:p>
-        </w:tc>
-        <w:tc>
-          <w:tcPr>
-            <w:tcW w:w="0" w:type="auto"/>
-            <w:tcBorders>
-              <w:top w:val="single" w:sz="6" w:space="0" w:color="CCCCCC"/>
-              <w:left w:val="single" w:sz="6" w:space="0" w:color="CCCCCC"/>
-              <w:bottom w:val="single" w:sz="6" w:space="0" w:color="CCCCCC"/>
-              <w:right w:val="single" w:sz="6" w:space="0" w:color="CCCCCC"/>
-            </w:tcBorders>
-            <w:shd w:val="clear" w:color="auto" w:fill="999999"/>
-            <w:tcMar>
-              <w:top w:w="30" w:type="dxa"/>
-              <w:left w:w="45" w:type="dxa"/>
-              <w:bottom w:w="30" w:type="dxa"/>
-              <w:right w:w="45" w:type="dxa"/>
-            </w:tcMar>
-            <w:vAlign w:val="bottom"/>
-            <w:hideMark/>
-          </w:tcPr>
-          <w:p>
-            <w:pPr>
-              <w:spacing w:after="0" w:line="240" w:lineRule="auto"/>
-              <w:rPr>
-                <w:rFonts w:eastAsia="Times New Roman" w:cs="Times New Roman"/>
-                <w:b/>
-                <w:bCs/>
-                <w:sz w:val="20"/>
-                <w:szCs w:val="20"/>
-                <w:lang w:val="en-GB" w:eastAsia="en-GB"/>
-              </w:rPr>
-            </w:pPr>
-            <w:r>
-              <w:rPr>
-                <w:rFonts w:eastAsia="Times New Roman" w:cs="Times New Roman"/>
-                <w:b/>
-                <w:bCs/>
-                <w:sz w:val="20"/>
-                <w:szCs w:val="20"/>
-                <w:lang w:val="en-GB" w:eastAsia="en-GB"/>
-              </w:rPr>
-              <w:t>neznámý</w:t>
             </w:r>
           </w:p>
         </w:tc>
@@ -13341,7 +13135,25 @@
                 <w:szCs w:val="24"/>
                 <w:lang w:eastAsia="cs-CZ"/>
               </w:rPr>
-              <w:t xml:space="preserve">zastínění vodní hladiny okolní vegetací </w:t>
+              <w:t xml:space="preserve">zastínění </w:t>
+            </w:r>
+            <w:r>
+              <w:rPr>
+                <w:rFonts w:eastAsia="Times New Roman" w:cs="Times New Roman"/>
+                <w:color w:val="000000"/>
+                <w:szCs w:val="24"/>
+                <w:lang w:eastAsia="cs-CZ"/>
+              </w:rPr>
+              <w:t>litorálu</w:t>
+            </w:r>
+            <w:r>
+              <w:rPr>
+                <w:rFonts w:eastAsia="Times New Roman" w:cs="Times New Roman"/>
+                <w:color w:val="000000"/>
+                <w:szCs w:val="24"/>
+                <w:lang w:eastAsia="cs-CZ"/>
+              </w:rPr>
+              <w:t xml:space="preserve"> okolní vegetací </w:t>
             </w:r>
           </w:p>
         </w:tc>
@@ -13515,35 +13327,18 @@
               </w:rPr>
               <w:t xml:space="preserve">plocha s hloubkou menší než </w:t>
             </w:r>
-            <w:del w:id="75" w:author="Jonáš Gaigr2" w:date="2026-08-19T17:01:00Z">
-              <w:r>
-                <w:rPr>
-                  <w:szCs w:val="24"/>
-                  <w:highlight w:val="yellow"/>
-                </w:rPr>
-                <w:delText>20</w:delText>
-              </w:r>
-              <w:r>
-                <w:rPr>
-                  <w:szCs w:val="24"/>
-                </w:rPr>
-                <w:delText xml:space="preserve"> </w:delText>
-              </w:r>
-            </w:del>
-            <w:ins w:id="76" w:author="Jonáš Gaigr2" w:date="2026-08-19T17:01:00Z">
-              <w:r>
-                <w:rPr>
-                  <w:szCs w:val="24"/>
-                </w:rPr>
-                <w:t>50</w:t>
-              </w:r>
-              <w:r>
-                <w:rPr>
-                  <w:szCs w:val="24"/>
-                </w:rPr>
-                <w:t xml:space="preserve"> </w:t>
-              </w:r>
-            </w:ins>
+            <w:r>
+              <w:rPr>
+                <w:szCs w:val="24"/>
+              </w:rPr>
+              <w:t>50</w:t>
+            </w:r>
+            <w:r>
+              <w:rPr>
+                <w:szCs w:val="24"/>
+              </w:rPr>
+              <w:t xml:space="preserve"> </w:t>
+            </w:r>
             <w:r>
               <w:rPr>
                 <w:szCs w:val="24"/>
@@ -13863,7 +13658,7 @@
         <w:spacing w:after="120" w:line="240" w:lineRule="auto"/>
         <w:ind w:left="2913"/>
         <w:rPr>
-          <w:del w:id="77" w:author="Jonáš Gaigr2" w:date="2026-08-07T00:36:00Z"/>
+          <w:del w:id="74" w:author="Jonáš Gaigr2" w:date="2026-08-07T00:36:00Z"/>
         </w:rPr>
       </w:pPr>
     </w:p>
@@ -13872,7 +13667,7 @@
         <w:pStyle w:val="Nadpis10"/>
         <w:spacing w:after="120" w:line="240" w:lineRule="auto"/>
         <w:rPr>
-          <w:del w:id="78" w:author="Lenka Jeřábková" w:date="2026-07-03T13:22:00Z"/>
+          <w:del w:id="75" w:author="Lenka Jeřábková" w:date="2026-07-03T13:22:00Z"/>
         </w:rPr>
       </w:pPr>
     </w:p>
@@ -13881,7 +13676,7 @@
         <w:pStyle w:val="Nadpis10"/>
         <w:spacing w:after="120" w:line="240" w:lineRule="auto"/>
         <w:rPr>
-          <w:del w:id="79" w:author="Lenka Jeřábková" w:date="2026-07-03T13:22:00Z"/>
+          <w:del w:id="76" w:author="Lenka Jeřábková" w:date="2026-07-03T13:22:00Z"/>
         </w:rPr>
       </w:pPr>
     </w:p>
@@ -13890,7 +13685,7 @@
         <w:pStyle w:val="Nadpis10"/>
         <w:spacing w:after="120" w:line="240" w:lineRule="auto"/>
         <w:rPr>
-          <w:del w:id="80" w:author="Jonáš Gaigr2" w:date="2026-08-07T00:36:00Z"/>
+          <w:del w:id="77" w:author="Jonáš Gaigr2" w:date="2026-08-07T00:36:00Z"/>
         </w:rPr>
       </w:pPr>
     </w:p>
@@ -13899,7 +13694,7 @@
         <w:pStyle w:val="Nadpis10"/>
         <w:spacing w:after="120" w:line="240" w:lineRule="auto"/>
         <w:rPr>
-          <w:del w:id="81" w:author="Lenka Jeřábková" w:date="2026-07-03T13:22:00Z"/>
+          <w:del w:id="78" w:author="Lenka Jeřábková" w:date="2026-07-03T13:22:00Z"/>
         </w:rPr>
       </w:pPr>
     </w:p>
@@ -13908,7 +13703,7 @@
         <w:pStyle w:val="Nadpis10"/>
         <w:spacing w:after="120" w:line="240" w:lineRule="auto"/>
         <w:rPr>
-          <w:del w:id="82" w:author="Lenka Jeřábková" w:date="2026-07-03T13:22:00Z"/>
+          <w:del w:id="79" w:author="Lenka Jeřábková" w:date="2026-07-03T13:22:00Z"/>
         </w:rPr>
       </w:pPr>
     </w:p>
@@ -43100,7 +42895,7 @@
       </w:r>
     </w:p>
   </w:comment>
-  <w:comment w:id="60" w:author="Jonáš Gaigr2" w:date="2026-08-06T09:38:00Z" w:initials="JG">
+  <w:comment w:id="59" w:author="Jonáš Gaigr2" w:date="2026-08-06T09:38:00Z" w:initials="JG">
     <w:p>
       <w:pPr>
         <w:pStyle w:val="Textkomente"/>
@@ -43116,7 +42911,7 @@
       </w:r>
     </w:p>
   </w:comment>
-  <w:comment w:id="61" w:author="Lenka Jeřábková" w:date="2026-08-06T12:39:00Z" w:initials="LJ">
+  <w:comment w:id="60" w:author="Lenka Jeřábková" w:date="2026-08-06T12:39:00Z" w:initials="LJ">
     <w:p>
       <w:pPr>
         <w:pStyle w:val="Textkomente"/>
@@ -43132,7 +42927,7 @@
       </w:r>
     </w:p>
   </w:comment>
-  <w:comment w:id="68" w:author="Lenka Jeřábková" w:date="2026-07-02T10:45:00Z" w:initials="LJ">
+  <w:comment w:id="67" w:author="Lenka Jeřábková" w:date="2026-07-02T10:45:00Z" w:initials="LJ">
     <w:p>
       <w:pPr>
         <w:pStyle w:val="Textkomente"/>
@@ -43148,7 +42943,7 @@
       </w:r>
     </w:p>
   </w:comment>
-  <w:comment w:id="69" w:author="Jonáš Gaigr2" w:date="2026-08-06T00:16:00Z" w:initials="JG">
+  <w:comment w:id="68" w:author="Jonáš Gaigr2" w:date="2026-08-06T00:16:00Z" w:initials="JG">
     <w:p>
       <w:pPr>
         <w:pStyle w:val="Textkomente"/>
@@ -43164,7 +42959,7 @@
       </w:r>
     </w:p>
   </w:comment>
-  <w:comment w:id="70" w:author="Lenka Jeřábková" w:date="2026-08-06T12:40:00Z" w:initials="LJ">
+  <w:comment w:id="69" w:author="Lenka Jeřábková" w:date="2026-08-06T12:40:00Z" w:initials="LJ">
     <w:p>
       <w:pPr>
         <w:pStyle w:val="Textkomente"/>
@@ -43180,7 +42975,7 @@
       </w:r>
     </w:p>
   </w:comment>
-  <w:comment w:id="72" w:author="Jonáš Gaigr2" w:date="2026-08-19T20:35:00Z" w:initials="JG">
+  <w:comment w:id="71" w:author="Jonáš Gaigr2" w:date="2026-08-19T20:35:00Z" w:initials="JG">
     <w:p>
       <w:pPr>
         <w:pStyle w:val="Textkomente"/>
@@ -43208,26 +43003,7 @@
         <w:annotationRef/>
       </w:r>
       <w:r>
-        <w:t>Chceme to hodnotit?</w:t>
-      </w:r>
-      <w:r>
-        <w:t xml:space="preserve"> Nestačí pravidelné vysychání a manipulace s hladinou?</w:t>
-      </w:r>
-    </w:p>
-  </w:comment>
-  <w:comment w:id="74" w:author="Lenka Jeřábková" w:date="2026-07-03T13:16:00Z" w:initials="LJ">
-    <w:p>
-      <w:pPr>
-        <w:pStyle w:val="Textkomente"/>
-      </w:pPr>
-      <w:r>
-        <w:rPr>
-          <w:rStyle w:val="Odkaznakoment"/>
-        </w:rPr>
-        <w:annotationRef/>
-      </w:r>
-      <w:r>
-        <w:t>tohle by asi mělo být před tabulkou, prvně hodnotíme DP a pak území, ne?</w:t>
+        <w:t>Chceme to hodnotit? Nestačí pravidelné vysychání a manipulace s hladinou?</w:t>
       </w:r>
     </w:p>
   </w:comment>
@@ -43254,9 +43030,8 @@
   <w15:commentEx w15:paraId="56D32364" w15:done="0"/>
   <w15:commentEx w15:paraId="5F4C4E43" w15:paraIdParent="56D32364" w15:done="0"/>
   <w15:commentEx w15:paraId="158D23FE" w15:paraIdParent="56D32364" w15:done="0"/>
-  <w15:commentEx w15:paraId="3C61613C" w15:done="0"/>
+  <w15:commentEx w15:paraId="2B5FBFA5" w15:done="0"/>
   <w15:commentEx w15:paraId="4A122BBC" w15:done="0"/>
-  <w15:commentEx w15:paraId="3A10138E" w15:done="0"/>
 </w15:commentsEx>
 </file>
 
@@ -45689,6 +45464,7 @@
   <w:style w:type="character" w:default="1" w:styleId="Standardnpsmoodstavce">
     <w:name w:val="Default Paragraph Font"/>
     <w:uiPriority w:val="1"/>
+    <w:semiHidden/>
     <w:unhideWhenUsed/>
   </w:style>
   <w:style w:type="table" w:default="1" w:styleId="Normlntabulka">
@@ -47910,7 +47686,7 @@
 </file>
 
 <file path=customXml/itemProps1.xml><?xml version="1.0" encoding="utf-8"?>
-<ds:datastoreItem xmlns:ds="http://schemas.openxmlformats.org/officeDocument/2006/customXml" ds:itemID="{5E34F166-21A7-40E5-9ED3-187FA5FA226D}">
+<ds:datastoreItem xmlns:ds="http://schemas.openxmlformats.org/officeDocument/2006/customXml" ds:itemID="{2FE0E715-6035-42A9-9543-C524B1B0C46E}">
   <ds:schemaRefs>
     <ds:schemaRef ds:uri="http://schemas.openxmlformats.org/officeDocument/2006/bibliography"/>
   </ds:schemaRefs>

</xml_diff>